<commit_message>
Cambios creación y comprobación de las pruebas UIT para flujo básico y alternativos
</commit_message>
<xml_diff>
--- a/test/AppForSEII2526.UIT/BonosComprados_UIT/CasoDePruebas_ComprarBonoBocadillo.docx
+++ b/test/AppForSEII2526.UIT/BonosComprados_UIT/CasoDePruebas_ComprarBonoBocadillo.docx
@@ -4035,8 +4035,61 @@
         <w:jc w:val="both"/>
       </w:pPr>
     </w:p>
+    <w:p>
+      <w:pPr>
+        <w:jc w:val="both"/>
+      </w:pPr>
+      <w:r>
+        <w:t xml:space="preserve">Los Bonos que debería haber en la base de datos son </w:t>
+      </w:r>
+    </w:p>
+    <w:p>
+      <w:pPr>
+        <w:jc w:val="both"/>
+      </w:pPr>
+      <w:r>
+        <w:rPr>
+          <w:noProof/>
+        </w:rPr>
+        <w:drawing>
+          <wp:inline distT="0" distB="0" distL="0" distR="0" wp14:anchorId="0DAF44CB" wp14:editId="68A1EF1A">
+            <wp:extent cx="5400040" cy="2473325"/>
+            <wp:effectExtent l="0" t="0" r="0" b="3175"/>
+            <wp:docPr id="2" name="Imagen 2"/>
+            <wp:cNvGraphicFramePr>
+              <a:graphicFrameLocks xmlns:a="http://schemas.openxmlformats.org/drawingml/2006/main" noChangeAspect="1"/>
+            </wp:cNvGraphicFramePr>
+            <a:graphic xmlns:a="http://schemas.openxmlformats.org/drawingml/2006/main">
+              <a:graphicData uri="http://schemas.openxmlformats.org/drawingml/2006/picture">
+                <pic:pic xmlns:pic="http://schemas.openxmlformats.org/drawingml/2006/picture">
+                  <pic:nvPicPr>
+                    <pic:cNvPr id="1" name=""/>
+                    <pic:cNvPicPr/>
+                  </pic:nvPicPr>
+                  <pic:blipFill>
+                    <a:blip r:embed="rId9"/>
+                    <a:stretch>
+                      <a:fillRect/>
+                    </a:stretch>
+                  </pic:blipFill>
+                  <pic:spPr>
+                    <a:xfrm>
+                      <a:off x="0" y="0"/>
+                      <a:ext cx="5400040" cy="2473325"/>
+                    </a:xfrm>
+                    <a:prstGeom prst="rect">
+                      <a:avLst/>
+                    </a:prstGeom>
+                  </pic:spPr>
+                </pic:pic>
+              </a:graphicData>
+            </a:graphic>
+          </wp:inline>
+        </w:drawing>
+      </w:r>
+    </w:p>
     <w:sectPr>
-      <w:footerReference w:type="default" r:id="rId9"/>
+      <w:footerReference w:type="default" r:id="rId10"/>
       <w:pgSz w:w="11906" w:h="16838"/>
       <w:pgMar w:top="1417" w:right="1701" w:bottom="1417" w:left="1701" w:header="708" w:footer="708" w:gutter="0"/>
       <w:pgNumType w:start="0"/>

</xml_diff>

<commit_message>
Desarrollo pruebas UIT crear resenya (#170)
* Cambios y creación de pruebas UIT

* Cambios creación y comprobación de las pruebas UIT para flujo básico y alternativos
</commit_message>
<xml_diff>
--- a/test/AppForSEII2526.UIT/BonosComprados_UIT/CasoDePruebas_ComprarBonoBocadillo.docx
+++ b/test/AppForSEII2526.UIT/BonosComprados_UIT/CasoDePruebas_ComprarBonoBocadillo.docx
@@ -4035,8 +4035,61 @@
         <w:jc w:val="both"/>
       </w:pPr>
     </w:p>
+    <w:p>
+      <w:pPr>
+        <w:jc w:val="both"/>
+      </w:pPr>
+      <w:r>
+        <w:t xml:space="preserve">Los Bonos que debería haber en la base de datos son </w:t>
+      </w:r>
+    </w:p>
+    <w:p>
+      <w:pPr>
+        <w:jc w:val="both"/>
+      </w:pPr>
+      <w:r>
+        <w:rPr>
+          <w:noProof/>
+        </w:rPr>
+        <w:drawing>
+          <wp:inline distT="0" distB="0" distL="0" distR="0" wp14:anchorId="0DAF44CB" wp14:editId="68A1EF1A">
+            <wp:extent cx="5400040" cy="2473325"/>
+            <wp:effectExtent l="0" t="0" r="0" b="3175"/>
+            <wp:docPr id="2" name="Imagen 2"/>
+            <wp:cNvGraphicFramePr>
+              <a:graphicFrameLocks xmlns:a="http://schemas.openxmlformats.org/drawingml/2006/main" noChangeAspect="1"/>
+            </wp:cNvGraphicFramePr>
+            <a:graphic xmlns:a="http://schemas.openxmlformats.org/drawingml/2006/main">
+              <a:graphicData uri="http://schemas.openxmlformats.org/drawingml/2006/picture">
+                <pic:pic xmlns:pic="http://schemas.openxmlformats.org/drawingml/2006/picture">
+                  <pic:nvPicPr>
+                    <pic:cNvPr id="1" name=""/>
+                    <pic:cNvPicPr/>
+                  </pic:nvPicPr>
+                  <pic:blipFill>
+                    <a:blip r:embed="rId9"/>
+                    <a:stretch>
+                      <a:fillRect/>
+                    </a:stretch>
+                  </pic:blipFill>
+                  <pic:spPr>
+                    <a:xfrm>
+                      <a:off x="0" y="0"/>
+                      <a:ext cx="5400040" cy="2473325"/>
+                    </a:xfrm>
+                    <a:prstGeom prst="rect">
+                      <a:avLst/>
+                    </a:prstGeom>
+                  </pic:spPr>
+                </pic:pic>
+              </a:graphicData>
+            </a:graphic>
+          </wp:inline>
+        </w:drawing>
+      </w:r>
+    </w:p>
     <w:sectPr>
-      <w:footerReference w:type="default" r:id="rId9"/>
+      <w:footerReference w:type="default" r:id="rId10"/>
       <w:pgSz w:w="11906" w:h="16838"/>
       <w:pgMar w:top="1417" w:right="1701" w:bottom="1417" w:left="1701" w:header="708" w:footer="708" w:gutter="0"/>
       <w:pgNumType w:start="0"/>

</xml_diff>